<commit_message>
Fix Portuguese metadata cell alignment
</commit_message>
<xml_diff>
--- a/backend/templates/template_pt.docx
+++ b/backend/templates/template_pt.docx
@@ -178,7 +178,7 @@
           <w:p>
             <w:pPr>
               <w:pStyle w:val="內文"/>
-              <w:spacing w:after="0" w:line="240" w:lineRule="auto"/>
+              <w:spacing w:after="0" w:line="240" w:lineRule="auto" w:before="0"/>
             </w:pPr>
             <w:r>
               <w:rPr>
@@ -212,6 +212,9 @@
             <w:vAlign w:val="center"/>
           </w:tcPr>
           <w:p>
+            <w:pPr>
+              <w:spacing w:before="0" w:after="0" w:line="240" w:lineRule="auto"/>
+            </w:pPr>
             <w:r>
               <w:t>{{ academic_year }}</w:t>
             </w:r>
@@ -238,7 +241,7 @@
           <w:p>
             <w:pPr>
               <w:pStyle w:val="內文"/>
-              <w:spacing w:after="0" w:line="240" w:lineRule="auto"/>
+              <w:spacing w:after="0" w:line="240" w:lineRule="auto" w:before="0"/>
             </w:pPr>
             <w:r>
               <w:rPr>
@@ -271,6 +274,9 @@
             <w:vAlign w:val="center"/>
           </w:tcPr>
           <w:p>
+            <w:pPr>
+              <w:spacing w:before="0" w:after="0" w:line="240" w:lineRule="auto"/>
+            </w:pPr>
             <w:r>
               <w:t>{{ semester }}</w:t>
             </w:r>
@@ -305,7 +311,7 @@
           <w:p>
             <w:pPr>
               <w:pStyle w:val="內文"/>
-              <w:spacing w:after="0" w:line="240" w:lineRule="auto"/>
+              <w:spacing w:after="0" w:line="240" w:lineRule="auto" w:before="0"/>
             </w:pPr>
             <w:r>
               <w:rPr>
@@ -359,6 +365,9 @@
             <w:vAlign w:val="center"/>
           </w:tcPr>
           <w:p>
+            <w:pPr>
+              <w:spacing w:before="0" w:after="0" w:line="240" w:lineRule="auto"/>
+            </w:pPr>
             <w:r>
               <w:t>{{ module_code }}</w:t>
             </w:r>
@@ -393,7 +402,7 @@
           <w:p>
             <w:pPr>
               <w:pStyle w:val="內文"/>
-              <w:spacing w:after="0" w:line="240" w:lineRule="auto"/>
+              <w:spacing w:after="0" w:line="240" w:lineRule="auto" w:before="0"/>
             </w:pPr>
             <w:r>
               <w:rPr>
@@ -427,6 +436,9 @@
             <w:vAlign w:val="center"/>
           </w:tcPr>
           <w:p>
+            <w:pPr>
+              <w:spacing w:before="0" w:after="0" w:line="240" w:lineRule="auto"/>
+            </w:pPr>
             <w:r>
               <w:t>{{ module_name }}</w:t>
             </w:r>
@@ -461,7 +473,7 @@
           <w:p>
             <w:pPr>
               <w:pStyle w:val="內文"/>
-              <w:spacing w:after="0" w:line="240" w:lineRule="auto"/>
+              <w:spacing w:after="0" w:line="240" w:lineRule="auto" w:before="0"/>
             </w:pPr>
             <w:r>
               <w:rPr>
@@ -515,6 +527,9 @@
             <w:vAlign w:val="center"/>
           </w:tcPr>
           <w:p>
+            <w:pPr>
+              <w:spacing w:before="0" w:after="0" w:line="240" w:lineRule="auto"/>
+            </w:pPr>
             <w:r>
               <w:t>{{ prerequisites }}</w:t>
             </w:r>
@@ -549,7 +564,7 @@
           <w:p>
             <w:pPr>
               <w:pStyle w:val="內文"/>
-              <w:spacing w:after="0" w:line="240" w:lineRule="auto"/>
+              <w:spacing w:after="0" w:line="240" w:lineRule="auto" w:before="0"/>
             </w:pPr>
             <w:r>
               <w:rPr>
@@ -603,6 +618,9 @@
             <w:vAlign w:val="center"/>
           </w:tcPr>
           <w:p>
+            <w:pPr>
+              <w:spacing w:before="0" w:after="0" w:line="240" w:lineRule="auto"/>
+            </w:pPr>
             <w:r>
               <w:t>{{ medium_of_instruction }}</w:t>
             </w:r>
@@ -637,7 +655,7 @@
           <w:p>
             <w:pPr>
               <w:pStyle w:val="內文"/>
-              <w:spacing w:after="0" w:line="240" w:lineRule="auto"/>
+              <w:spacing w:after="0" w:line="240" w:lineRule="auto" w:before="0"/>
             </w:pPr>
             <w:r>
               <w:rPr>
@@ -690,6 +708,9 @@
             <w:vAlign w:val="center"/>
           </w:tcPr>
           <w:p>
+            <w:pPr>
+              <w:spacing w:before="0" w:after="0" w:line="240" w:lineRule="auto"/>
+            </w:pPr>
             <w:r>
               <w:t>{{ credits }}</w:t>
             </w:r>
@@ -717,7 +738,7 @@
           <w:p>
             <w:pPr>
               <w:pStyle w:val="內文"/>
-              <w:spacing w:after="0" w:line="240" w:lineRule="auto"/>
+              <w:spacing w:after="0" w:line="240" w:lineRule="auto" w:before="0"/>
             </w:pPr>
             <w:r>
               <w:rPr>
@@ -750,6 +771,9 @@
             <w:vAlign w:val="center"/>
           </w:tcPr>
           <w:p>
+            <w:pPr>
+              <w:spacing w:before="0" w:after="0" w:line="240" w:lineRule="auto"/>
+            </w:pPr>
             <w:r>
               <w:t>{{ contact_hours }}</w:t>
             </w:r>
@@ -784,7 +808,7 @@
           <w:p>
             <w:pPr>
               <w:pStyle w:val="內文"/>
-              <w:spacing w:after="0" w:line="240" w:lineRule="auto"/>
+              <w:spacing w:after="0" w:line="240" w:lineRule="auto" w:before="0"/>
             </w:pPr>
             <w:r>
               <w:rPr>
@@ -817,6 +841,9 @@
             <w:vAlign w:val="center"/>
           </w:tcPr>
           <w:p>
+            <w:pPr>
+              <w:spacing w:before="0" w:after="0" w:line="240" w:lineRule="auto"/>
+            </w:pPr>
             <w:r>
               <w:t>{{ instructor }}</w:t>
             </w:r>
@@ -844,7 +871,7 @@
           <w:p>
             <w:pPr>
               <w:pStyle w:val="內文"/>
-              <w:spacing w:after="0" w:line="240" w:lineRule="auto"/>
+              <w:spacing w:after="0" w:line="240" w:lineRule="auto" w:before="0"/>
             </w:pPr>
             <w:r>
               <w:rPr>
@@ -877,6 +904,9 @@
             <w:vAlign w:val="center"/>
           </w:tcPr>
           <w:p>
+            <w:pPr>
+              <w:spacing w:before="0" w:after="0" w:line="240" w:lineRule="auto"/>
+            </w:pPr>
             <w:r>
               <w:t>{{ email }}</w:t>
             </w:r>
@@ -911,7 +941,7 @@
           <w:p>
             <w:pPr>
               <w:pStyle w:val="內文"/>
-              <w:spacing w:after="0" w:line="240" w:lineRule="auto"/>
+              <w:spacing w:after="0" w:line="240" w:lineRule="auto" w:before="0"/>
             </w:pPr>
             <w:r>
               <w:rPr>
@@ -944,6 +974,9 @@
             <w:vAlign w:val="center"/>
           </w:tcPr>
           <w:p>
+            <w:pPr>
+              <w:spacing w:before="0" w:after="0" w:line="240" w:lineRule="auto"/>
+            </w:pPr>
             <w:r>
               <w:t>{{ office }}</w:t>
             </w:r>
@@ -971,7 +1004,7 @@
           <w:p>
             <w:pPr>
               <w:pStyle w:val="內文"/>
-              <w:spacing w:after="0" w:line="240" w:lineRule="auto"/>
+              <w:spacing w:after="0" w:line="240" w:lineRule="auto" w:before="0"/>
             </w:pPr>
             <w:r>
               <w:rPr>
@@ -1024,6 +1057,9 @@
             <w:vAlign w:val="center"/>
           </w:tcPr>
           <w:p>
+            <w:pPr>
+              <w:spacing w:before="0" w:after="0" w:line="240" w:lineRule="auto"/>
+            </w:pPr>
             <w:r>
               <w:t>{{ office_phone }}</w:t>
             </w:r>

</xml_diff>